<commit_message>
Update binary files and add new document template
- Updated the compiled Python files for docx_shell and xlsx_toc in the __pycache__ directory.
- Added a new Word document template: L_Shell_Template_v2.1.0.docx.
</commit_message>
<xml_diff>
--- a/output/TFL_Shell_SOP_v2.1.0.docx
+++ b/output/TFL_Shell_SOP_v2.1.0.docx
@@ -319,7 +319,7 @@
           <w:rFonts w:ascii="Times New Roman" w:hAnsi="Times New Roman"/>
           <w:sz w:val="22"/>
         </w:rPr>
-        <w:t>The governed shell scope includes CSR Sections 14.1, 14.2, 14.3, 14.4, and 16.2 only.</w:t>
+        <w:t>The governed shell scope includes CSR Sections 14.1, 14.2, 14.3, 14.4, and 16.2 only; Section 16.1 is excluded from this generator scope.</w:t>
       </w:r>
     </w:p>
     <w:p>
@@ -431,7 +431,7 @@
           <w:rFonts w:ascii="Times New Roman" w:hAnsi="Times New Roman"/>
           <w:sz w:val="22"/>
         </w:rPr>
-        <w:t>Companion workbook: The synchronized XLSX catalog and usage guide generated alongside the DOCX shell template.</w:t>
+        <w:t>Companion workbook: The synchronized XLSX catalog and usage guide generated alongside the DOCX shell template; it is not a workflow tracker.</w:t>
       </w:r>
     </w:p>
     <w:p>
@@ -700,6 +700,15 @@
           <w:rFonts w:ascii="Times New Roman" w:hAnsi="Times New Roman"/>
           <w:sz w:val="22"/>
         </w:rPr>
+        <w:t>Listing shells must not introduce fabricated subject-level records; only structural examples and result-free placeholders are permitted.</w:t>
+      </w:r>
+    </w:p>
+    <w:p>
+      <w:r>
+        <w:rPr>
+          <w:rFonts w:ascii="Times New Roman" w:hAnsi="Times New Roman"/>
+          <w:sz w:val="22"/>
+        </w:rPr>
         <w:t>If a shell requires placeholder headers before study-specific terminology is finalized, neutral labels may be used temporarily so long as they remain governance-appropriate and result-free.</w:t>
       </w:r>
     </w:p>
@@ -789,7 +798,7 @@
           <w:rFonts w:ascii="Times New Roman" w:hAnsi="Times New Roman"/>
           <w:sz w:val="22"/>
         </w:rPr>
-        <w:t>Each TFL should remain on one page when reasonably possible through spacing control and layout tuning.</w:t>
+        <w:t>Each TFL should remain on one page when reasonably possible through spacing control and layout tuning; this is a best-effort formatting rule rather than an absolute guarantee for every shell.</w:t>
       </w:r>
     </w:p>
     <w:p>
@@ -838,7 +847,7 @@
           <w:rFonts w:ascii="Times New Roman" w:hAnsi="Times New Roman"/>
           <w:sz w:val="22"/>
         </w:rPr>
-        <w:t>Applicability labels must clearly distinguish general, oncology-only, and non-oncology-only shells.</w:t>
+        <w:t>Applicability labels must clearly distinguish general, oncology-only, and non-oncology-only shells, and those labels guide shell selection for a specific study.</w:t>
       </w:r>
     </w:p>
     <w:p>

</xml_diff>

<commit_message>
fix: restore TFL titles in TOC as Heading 4, expand TOC depth to 4 levels
</commit_message>
<xml_diff>
--- a/output/TFL_Shell_SOP_v2.1.0.docx
+++ b/output/TFL_Shell_SOP_v2.1.0.docx
@@ -1575,12 +1575,13 @@
       <w:outlineLvl w:val="3"/>
     </w:pPr>
     <w:rPr>
-      <w:rFonts w:asciiTheme="majorHAnsi" w:eastAsiaTheme="majorEastAsia" w:hAnsiTheme="majorHAnsi" w:cstheme="majorBidi"/>
+      <w:rFonts w:asciiTheme="majorHAnsi" w:eastAsiaTheme="majorEastAsia" w:hAnsiTheme="majorHAnsi" w:cstheme="majorBidi" w:ascii="Times New Roman" w:hAnsi="Times New Roman"/>
       <w:b/>
       <w:bCs/>
       <w:i/>
       <w:iCs/>
-      <w:color w:val="4F81BD" w:themeColor="accent1"/>
+      <w:color w:val="000000"/>
+      <w:sz w:val="20"/>
     </w:rPr>
   </w:style>
   <w:style w:type="paragraph" w:styleId="Heading5">

</xml_diff>

<commit_message>
feat: Update documentation and code to exclude Section 16.1 from scope across various components
</commit_message>
<xml_diff>
--- a/output/TFL_Shell_SOP_v2.1.0.docx
+++ b/output/TFL_Shell_SOP_v2.1.0.docx
@@ -126,7 +126,7 @@
                 <w:rFonts w:ascii="Times New Roman" w:hAnsi="Times New Roman"/>
                 <w:sz w:val="22"/>
               </w:rPr>
-              <w:t>06 May 2026</w:t>
+              <w:t>07 May 2026</w:t>
             </w:r>
           </w:p>
         </w:tc>
@@ -319,7 +319,7 @@
           <w:rFonts w:ascii="Times New Roman" w:hAnsi="Times New Roman"/>
           <w:sz w:val="22"/>
         </w:rPr>
-        <w:t>The governed shell scope includes CSR Sections 14.1, 14.2, 14.3, 14.4, and 16.2 only; Section 16.1 is excluded from this generator scope.</w:t>
+        <w:t>The governed shell scope includes CSR Sections 14.1, 14.2, 14.3, 14.4, and 16.2.</w:t>
       </w:r>
     </w:p>
     <w:p>

</xml_diff>

<commit_message>
feat: audit TFL layouts and sync skill contracts
</commit_message>
<xml_diff>
--- a/output/TFL_Shell_SOP_v2.1.0.docx
+++ b/output/TFL_Shell_SOP_v2.1.0.docx
@@ -126,7 +126,7 @@
                 <w:rFonts w:ascii="Times New Roman" w:hAnsi="Times New Roman"/>
                 <w:sz w:val="22"/>
               </w:rPr>
-              <w:t>17 June 2026</w:t>
+              <w:t>14 August 2026</w:t>
             </w:r>
           </w:p>
         </w:tc>
@@ -691,7 +691,7 @@
           <w:rFonts w:ascii="Times New Roman" w:hAnsi="Times New Roman"/>
           <w:sz w:val="22"/>
         </w:rPr>
-        <w:t>Controlled tables should use `Group 1`, `Group 2`, and an optional separate ellipsis (`...`) expansion column. The expansion column must remain distinct and must not be merged with Overall, HR, Total, or other analytic columns. Header sample sizes must remain generic (for example N=xx) rather than concrete counts.</w:t>
+        <w:t>Treatment groups may be displayed as columns, rows, or grouped subheaders according to the analysis, information density, and programming feasibility. Model estimates and treatment comparisons must remain independently identifiable and must not be placed under a treatment group merely to preserve a uniform template. Header sample sizes must remain generic (for example N=xx) rather than concrete counts.</w:t>
       </w:r>
     </w:p>
     <w:p>
@@ -771,7 +771,7 @@
           <w:rFonts w:ascii="Times New Roman" w:hAnsi="Times New Roman"/>
           <w:sz w:val="22"/>
         </w:rPr>
-        <w:t>All shell header and body cells are left-aligned to preserve review readability and consistent shell semantics.</w:t>
+        <w:t>Alignment follows column semantics: structural labels are generally left-aligned, numeric/statistical result columns are centered or decimal-aligned where supported, and listing identifiers or text fields may remain left-aligned. Multi-level headers must preserve their declared column spans.</w:t>
       </w:r>
     </w:p>
     <w:p>

</xml_diff>